<commit_message>
feat: picture replace widget, building block gallery, and leading symbol layout
A picture content control paints a picker widget. A press selects the
picture, hands a picture session to a host renderer, or opens the
engine's own file dialog; the chosen image lands through replaceImage
and keeps the drawing's size. Inline drawings now give a control its
geometry, which a picture control needs to paint a widget at all.

A building block gallery control lists the blocks the document's
glossary stores for its gallery and category. A pick lands the block's
body through the new insertBuildingBlock op with fresh identities. The
engine menu shows a note when the gallery is empty.

A paragraph whose first content is a w:sym glyph now lays it out: the
paragraph breaker dropped every zero-width projected piece at the start
offset. A collapsed caret before such a glyph reports the run's font.

Fixes #905
Fixes #906
Fixes #907

Co-Authored-By: Claude Fable 5.1 <noreply@anthropic.com>
</commit_message>
<xml_diff>
--- a/e2e/fixtures/form-controls-catalog.docx
+++ b/e2e/fixtures/form-controls-catalog.docx
@@ -1253,6 +1253,50 @@
               <w:rStyle w:val="PlaceholderText"/>
             </w:rPr>
             <w:t>Choose a building block.</w:t>
+          </w:r>
+        </w:p>
+      </w:docPartBody>
+    </w:docPart>
+    <w:docPart>
+      <w:docPartPr>
+        <w:name w:val="Sign-off line"/>
+        <w:category>
+          <w:name w:val="General"/>
+          <w:gallery w:val="docParts"/>
+        </w:category>
+        <w:types>
+          <w:type w:val="bbNormal"/>
+        </w:types>
+        <w:behaviors>
+          <w:behavior w:val="content"/>
+        </w:behaviors>
+      </w:docPartPr>
+      <w:docPartBody>
+        <w:p>
+          <w:r>
+            <w:t xml:space="preserve">Approved by: ____________  Date: ____________</w:t>
+          </w:r>
+        </w:p>
+      </w:docPartBody>
+    </w:docPart>
+    <w:docPart>
+      <w:docPartPr>
+        <w:name w:val="Address block"/>
+        <w:category>
+          <w:name w:val="General"/>
+          <w:gallery w:val="docParts"/>
+        </w:category>
+        <w:types>
+          <w:type w:val="bbNormal"/>
+        </w:types>
+        <w:behaviors>
+          <w:behavior w:val="content"/>
+        </w:behaviors>
+      </w:docPartPr>
+      <w:docPartBody>
+        <w:p>
+          <w:r>
+            <w:t>123 Example Street, Springfield</w:t>
           </w:r>
         </w:p>
       </w:docPartBody>

</xml_diff>